<commit_message>
docs: planeja integrações remotas controladas
</commit_message>
<xml_diff>
--- a/documentacao-local/Proposta_Produto_App_Ingressos_Android.docx
+++ b/documentacao-local/Proposta_Produto_App_Ingressos_Android.docx
@@ -8165,6 +8165,34 @@
         <w:spacing w:after="40"/>
       </w:pPr>
     </w:p>
+    <w:p>
+      <w:pPr>
+        <w:pStyle w:val="Heading1"/>
+      </w:pPr>
+      <w:r>
+        <w:t>13. T4 — Integrações remotas controladas</w:t>
+      </w:r>
+    </w:p>
+    <w:p>
+      <w:r>
+        <w:t>Após a conclusão local de T1–T3, a T4 habilita integrações remotas somente mediante autorização explícita, SDK/API Cielo compatível, credenciais sandbox configuradas fora do código e destino de publicação definido pela pessoa responsável.</w:t>
+      </w:r>
+    </w:p>
+    <w:p>
+      <w:r>
+        <w:t>Aceite: o adaptador remoto permanece atrás de PaymentGateway; respostas são sanitizadas e mapeadas; purchaseId impede nova cobrança; falhas preservam o comprovante local; segredos não entram no Git; e a publicação ocorre somente após build, testes unitários, instrumentados, UI e sandbox aprovados.</w:t>
+      </w:r>
+    </w:p>
+    <w:p>
+      <w:r>
+        <w:t>A T4 não autoriza criar contas, credenciais, cartões, repositórios ou publicar dados por conta própria. Produção exige backend e controles PCI DSS; o APK não deve conter MerchantKey.</w:t>
+      </w:r>
+    </w:p>
+    <w:p>
+      <w:r>
+        <w:t>Especificação completa: documentacao-local/tasks/T4.md.</w:t>
+      </w:r>
+    </w:p>
     <w:sectPr>
       <w:headerReference w:type="default" r:id="rId9"/>
       <w:footerReference w:type="default" r:id="rId10"/>

</xml_diff>

<commit_message>
feat: adiciona ícone e identidade SellCie
</commit_message>
<xml_diff>
--- a/documentacao-local/Proposta_Produto_App_Ingressos_Android.docx
+++ b/documentacao-local/Proposta_Produto_App_Ingressos_Android.docx
@@ -8193,6 +8193,24 @@
         <w:t>Especificação completa: documentacao-local/tasks/T4.md.</w:t>
       </w:r>
     </w:p>
+    <w:p>
+      <w:pPr>
+        <w:pStyle w:val="Heading1"/>
+      </w:pPr>
+      <w:r>
+        <w:t>14. Identidade visual — SellCie</w:t>
+      </w:r>
+    </w:p>
+    <w:p>
+      <w:r>
+        <w:t>A identidade visual local passa a usar o nome SellCie e um ícone de launcher próprio: ticket azul com marca de confirmação, sem texto e com fundo transparente. O ativo foi gerado como ilustração rasterizada e exportado em PNG para as densidades Android mdpi, hdpi, xhdpi, xxhdpi e xxxhdpi.</w:t>
+      </w:r>
+    </w:p>
+    <w:p>
+      <w:r>
+        <w:t>Validação: inspeção visual na densidade xxxhdpi, substituição dos ícones padrão do template, remoção dos drawables não utilizados, verificação de diff sem whitespace inválido e build offline :app:assembleDebug aprovado. A geração não usa dados pessoais, credenciais ou marcas de terceiros.</w:t>
+      </w:r>
+    </w:p>
     <w:sectPr>
       <w:headerReference w:type="default" r:id="rId9"/>
       <w:footerReference w:type="default" r:id="rId10"/>

</xml_diff>

<commit_message>
feat: adiciona confirmação e ingressos comprados
</commit_message>
<xml_diff>
--- a/documentacao-local/Proposta_Produto_App_Ingressos_Android.docx
+++ b/documentacao-local/Proposta_Produto_App_Ingressos_Android.docx
@@ -8211,6 +8211,39 @@
         <w:t>Validação: inspeção visual na densidade xxxhdpi, substituição dos ícones padrão do template, remoção dos drawables não utilizados, verificação de diff sem whitespace inválido e build offline :app:assembleDebug aprovado. A geração não usa dados pessoais, credenciais ou marcas de terceiros.</w:t>
       </w:r>
     </w:p>
+    <w:p>
+      <w:pPr>
+        <w:pStyle w:val="Heading1"/>
+      </w:pPr>
+      <w:r>
+        <w:t>15. Evolução local — confirmação e meus ingressos</w:t>
+      </w:r>
+    </w:p>
+    <w:p>
+      <w:r>
+        <w:t>A jornada local passou a exigir uma confirmação explícita antes do processamento: catálogo → confirmação da compra → processamento → comprovante. Na confirmação, o usuário pode revisar quantidade e total, confirmar a compra ou retornar ao catálogo sem iniciar uma tentativa de pagamento.</w:t>
+      </w:r>
+    </w:p>
+    <w:p>
+      <w:r>
+        <w:t>Após uma aprovação, o comprovante discrimina os itens do pedido e disponibiliza a ação Ver meus ingressos. A nova tela apresenta um cartão por ingresso adquirido, inclusive quando há mais de uma unidade do mesmo evento, com nome do evento, posição do ingresso na quantidade adquirida e um campo individual reservado ao QR Code. O identificador exibido é determinístico a partir da compra, evento e unidade; a geração de QR Code escaneável permanece uma evolução futura, sem dependência externa neste escopo offline.</w:t>
+      </w:r>
+    </w:p>
+    <w:p>
+      <w:r>
+        <w:t>Ao retornar ao catálogo após uma compra aprovada, o carrinho é limpo (quantidades e total). Em resultado não aprovado, a seleção é preservada para uma nova tentativa. O processamento mantém o bloqueio contra dupla submissão por purchaseId.</w:t>
+      </w:r>
+    </w:p>
+    <w:p>
+      <w:r>
+        <w:t>Critérios de aceite da evolução: (E1) o pagamento não começa antes do clique em Confirmar compra; (E2) é possível voltar ao catálogo antes da confirmação; (E3) somente comprovante aprovado oferece Ver meus ingressos; (E4) cada unidade comprada gera um cartão com campo de QR Code; (E5) voltar de comprovante ou ingressos aprovados limpa o carrinho; (E6) resultados não aprovados mantêm a seleção.</w:t>
+      </w:r>
+    </w:p>
+    <w:p>
+      <w:r>
+        <w:t>Validação local: testes unitários para o retorno ao catálogo e testes Compose para confirmação, comprovante e ingressos individuais; build offline assembleDebug, testDebugUnitTest e connectedDebugAndroidTest aprovados no emulador Android local.</w:t>
+      </w:r>
+    </w:p>
     <w:sectPr>
       <w:headerReference w:type="default" r:id="rId9"/>
       <w:footerReference w:type="default" r:id="rId10"/>

</xml_diff>